<commit_message>
Method paper: add Chapter 11 — token accounting (measured analysis layer ~2M vs estimated orchestration ~150-300M; the ratio as finding)
</commit_message>
<xml_diff>
--- a/release/method_from-227-to-30_policymaker-edition.docx
+++ b/release/method_from-227-to-30_policymaker-edition.docx
@@ -1125,6 +1125,243 @@
           <w:rFonts w:ascii="Arial" w:cs="Arial" w:eastAsia="Arial" w:hAnsi="Arial"/>
         </w:rPr>
         <w:t xml:space="preserve">the artificial intelligence made this work fast; the verification architecture — floors in code, citation-or-silence, effect classification, human gates, and a held-out benchmark — is what makes it usable. Speed without that architecture is just a faster way to produce something no regulator could rely on.</w:t>
+      </w:r>
+    </w:p>
+    <w:p>
+      <w:pPr>
+        <w:pStyle w:val="Heading1"/>
+      </w:pPr>
+      <w:r>
+        <w:t xml:space="preserve">Chapter 11 — What it cost: a token accounting</w:t>
+      </w:r>
+    </w:p>
+    <w:p>
+      <w:pPr>
+        <w:shd w:fill="F3F6FA" w:val="clear"/>
+        <w:spacing w:after="130" w:before="40"/>
+      </w:pPr>
+      <w:r>
+        <w:rPr>
+          <w:rFonts w:ascii="Arial" w:cs="Arial" w:eastAsia="Arial" w:hAnsi="Arial"/>
+          <w:b/>
+          <w:bCs/>
+          <w:color w:val="1F3864"/>
+          <w:sz w:val="19"/>
+          <w:szCs w:val="19"/>
+        </w:rPr>
+        <w:t xml:space="preserve">The question this chapter answers:  </w:t>
+      </w:r>
+      <w:r>
+        <w:rPr>
+          <w:rFonts w:ascii="Arial" w:cs="Arial" w:eastAsia="Arial" w:hAnsi="Arial"/>
+          <w:color w:val="374151"/>
+          <w:sz w:val="19"/>
+          <w:szCs w:val="19"/>
+        </w:rPr>
+        <w:t xml:space="preserve">what did stages 2–6 actually consume in computation — and where did it go?</w:t>
+      </w:r>
+    </w:p>
+    <w:p>
+      <w:pPr>
+        <w:spacing w:after="130"/>
+      </w:pPr>
+      <w:r>
+        <w:rPr>
+          <w:rFonts w:ascii="Arial" w:cs="Arial" w:eastAsia="Arial" w:hAnsi="Arial"/>
+        </w:rPr>
+        <w:t xml:space="preserve">Because every model call in the analysis pipeline was cached and committed, one layer of this answer is measured rather than estimated. The other layer — the AI agent sessions that orchestrated the work — leaves no telemetry in the repository, so those figures are reasoned estimates with real uncertainty (a factor of two to three either way). Both layers are reported; the ratio between them is the finding.</w:t>
+      </w:r>
+    </w:p>
+    <w:p>
+      <w:pPr>
+        <w:pStyle w:val="Heading2"/>
+      </w:pPr>
+      <w:r>
+        <w:t xml:space="preserve">Layer 1 — The analysis itself (measured or reported per stage)</w:t>
+      </w:r>
+    </w:p>
+    <w:p>
+      <w:pPr>
+        <w:pStyle w:val="ListParagraph"/>
+        <w:numPr>
+          <w:ilvl w:val="0"/>
+          <w:numId w:val="2"/>
+        </w:numPr>
+        <w:spacing w:after="70"/>
+      </w:pPr>
+      <w:r>
+        <w:rPr>
+          <w:rFonts w:ascii="Arial" w:cs="Arial" w:eastAsia="Arial" w:hAnsi="Arial"/>
+        </w:rPr>
+        <w:t xml:space="preserve">Stages 2–3 (calculus port, closure test, engine build, citation verification): zero model tokens — by design. The vocabulary work was done by hand, the engine is deterministic code, and verification is retrieval plus comparison, not generation.</w:t>
+      </w:r>
+    </w:p>
+    <w:p>
+      <w:pPr>
+        <w:pStyle w:val="ListParagraph"/>
+        <w:numPr>
+          <w:ilvl w:val="0"/>
+          <w:numId w:val="2"/>
+        </w:numPr>
+        <w:spacing w:after="70"/>
+      </w:pPr>
+      <w:r>
+        <w:rPr>
+          <w:rFonts w:ascii="Arial" w:cs="Arial" w:eastAsia="Arial" w:hAnsi="Arial"/>
+        </w:rPr>
+        <w:t xml:space="preserve">Stage 4 (the AI layer over the pilot clusters): 68 calls, ~244,000 tokens (205k input / 39k output) — exact, from the run report.</w:t>
+      </w:r>
+    </w:p>
+    <w:p>
+      <w:pPr>
+        <w:pStyle w:val="ListParagraph"/>
+        <w:numPr>
+          <w:ilvl w:val="0"/>
+          <w:numId w:val="2"/>
+        </w:numPr>
+        <w:spacing w:after="70"/>
+      </w:pPr>
+      <w:r>
+        <w:rPr>
+          <w:rFonts w:ascii="Arial" w:cs="Arial" w:eastAsia="Arial" w:hAnsi="Arial"/>
+        </w:rPr>
+        <w:t xml:space="preserve">Stage 5 (corpus scale-out): ~180 calls, an estimated 550–700,000 tokens — call count exact, token figure extrapolated from the stage-4 per-call profile.</w:t>
+      </w:r>
+    </w:p>
+    <w:p>
+      <w:pPr>
+        <w:pStyle w:val="ListParagraph"/>
+        <w:numPr>
+          <w:ilvl w:val="0"/>
+          <w:numId w:val="2"/>
+        </w:numPr>
+        <w:spacing w:after="70"/>
+      </w:pPr>
+      <w:r>
+        <w:rPr>
+          <w:rFonts w:ascii="Arial" w:cs="Arial" w:eastAsia="Arial" w:hAnsi="Arial"/>
+        </w:rPr>
+        <w:t xml:space="preserve">Stage 6 (RBI benchmark, engine plus baseline over 163 circulars): ~200–300 calls, an estimated 700,000–1,200,000 tokens.</w:t>
+      </w:r>
+    </w:p>
+    <w:p>
+      <w:pPr>
+        <w:spacing w:after="130"/>
+      </w:pPr>
+      <w:r>
+        <w:rPr>
+          <w:rFonts w:ascii="Arial" w:cs="Arial" w:eastAsia="Arial" w:hAnsi="Arial"/>
+        </w:rPr>
+        <w:t xml:space="preserve">Total for the regulatory analysis proper: roughly 450–550 model calls and approximately 1.5–2 million tokens — every one of them cached in the repository, keyed by prompt hash, and replayable offline.</w:t>
+      </w:r>
+    </w:p>
+    <w:p>
+      <w:pPr>
+        <w:pStyle w:val="Heading2"/>
+      </w:pPr>
+      <w:r>
+        <w:t xml:space="preserve">Layer 2 — The orchestration (estimated)</w:t>
+      </w:r>
+    </w:p>
+    <w:p>
+      <w:pPr>
+        <w:spacing w:after="130"/>
+      </w:pPr>
+      <w:r>
+        <w:rPr>
+          <w:rFonts w:ascii="Arial" w:cs="Arial" w:eastAsia="Arial" w:hAnsi="Arial"/>
+        </w:rPr>
+        <w:t xml:space="preserve">The analysis calls were made by AI coding agents that read the specifications, wrote and tested the software, ran the pipelines, and wrote the reports — seven long agent sessions for the build and stages, plus the planning-and-review session that produced the specifications and human decision packets. Agentic sessions are input-dominated: each working turn re-reads a large and growing context, mostly served from prompt cache. Reasonable arithmetic — seven sessions of 50–150 turns at 100–200,000 tokens of context per turn — puts the orchestration layer at roughly 100–250 million tokens processed, of which perhaps 25–60 million were fresh (non-cache-served) tokens.</w:t>
+      </w:r>
+    </w:p>
+    <w:p>
+      <w:pPr>
+        <w:pStyle w:val="Heading2"/>
+      </w:pPr>
+      <w:r>
+        <w:t xml:space="preserve">The ratio is the finding</w:t>
+      </w:r>
+    </w:p>
+    <w:p>
+      <w:pPr>
+        <w:spacing w:after="130"/>
+      </w:pPr>
+      <w:r>
+        <w:rPr>
+          <w:rFonts w:ascii="Arial" w:cs="Arial" w:eastAsia="Arial" w:hAnsi="Arial"/>
+        </w:rPr>
+        <w:t xml:space="preserve">End to end, stages 2–6 processed on the order of 150–300 million tokens — and the actual regulatory analysis accounted for about 2 million of them, under 1.5 percent. More than 98 percent of the computation was scaffolding: agents reading specifications, writing and testing code, and re-reading their own artifacts. Three implications follow.</w:t>
+      </w:r>
+    </w:p>
+    <w:p>
+      <w:pPr>
+        <w:pStyle w:val="ListParagraph"/>
+        <w:numPr>
+          <w:ilvl w:val="0"/>
+          <w:numId w:val="2"/>
+        </w:numPr>
+        <w:spacing w:after="70"/>
+      </w:pPr>
+      <w:r>
+        <w:rPr>
+          <w:rFonts w:ascii="Arial" w:cs="Arial" w:eastAsia="Arial" w:hAnsi="Arial"/>
+        </w:rPr>
+        <w:t xml:space="preserve">The analysis layer is cheap and auditable. The ~2 million tokens that constitute the legal-analytical work are committed to the repository call by call. Re-verifying the entire analytical record costs nothing; extending it costs on the order of tens of dollars, not staff-years.</w:t>
+      </w:r>
+    </w:p>
+    <w:p>
+      <w:pPr>
+        <w:pStyle w:val="ListParagraph"/>
+        <w:numPr>
+          <w:ilvl w:val="0"/>
+          <w:numId w:val="2"/>
+        </w:numPr>
+        <w:spacing w:after="70"/>
+      </w:pPr>
+      <w:r>
+        <w:rPr>
+          <w:rFonts w:ascii="Arial" w:cs="Arial" w:eastAsia="Arial" w:hAnsi="Arial"/>
+        </w:rPr>
+        <w:t xml:space="preserve">The overhead is scaffolding, not analysis — and scaffolding costs fall fast. The 98 percent was spent building a reusable engine and its guardrails. A second corpus run on the same engine skips most of it; this is why the adapter recipe in the replication guide is short.</w:t>
+      </w:r>
+    </w:p>
+    <w:p>
+      <w:pPr>
+        <w:pStyle w:val="ListParagraph"/>
+        <w:numPr>
+          <w:ilvl w:val="0"/>
+          <w:numId w:val="2"/>
+        </w:numPr>
+        <w:spacing w:after="70"/>
+      </w:pPr>
+      <w:r>
+        <w:rPr>
+          <w:rFonts w:ascii="Arial" w:cs="Arial" w:eastAsia="Arial" w:hAnsi="Arial"/>
+        </w:rPr>
+        <w:t xml:space="preserve">The comparison to the alternative is not close. The RBI's equivalent exercise consumed 40-plus staff over multiple years. Even at the top of the estimate range, and even priced at premium model rates, the computation here costs less than a single staff-week — the binding constraint on regulatory clean-up has moved from analytical labor to review capacity and institutional will.</w:t>
+      </w:r>
+    </w:p>
+    <w:p>
+      <w:pPr>
+        <w:spacing w:after="130"/>
+        <w:rPr>
+          <w:i/>
+          <w:iCs/>
+          <w:color w:val="6B7280"/>
+          <w:sz w:val="19"/>
+          <w:szCs w:val="19"/>
+        </w:rPr>
+      </w:pPr>
+      <w:r>
+        <w:rPr>
+          <w:rFonts w:ascii="Arial" w:cs="Arial" w:eastAsia="Arial" w:hAnsi="Arial"/>
+          <w:i/>
+          <w:iCs/>
+          <w:color w:val="6B7280"/>
+          <w:sz w:val="19"/>
+          <w:szCs w:val="19"/>
+        </w:rPr>
+        <w:t xml:space="preserve">Caveat, stated plainly: the Layer 2 figures are estimates. The repository preserves no session telemetry, and the honest uncertainty is two- to three-fold. The Layer 1 figures — the ones that bear on the trustworthiness of the analysis — are measured.</w:t>
       </w:r>
     </w:p>
     <w:sectPr>

</xml_diff>

<commit_message>
Method Ch.11 now measured: 225.1M processed / 97.9% cache reads / 4.8M fresh / ~1.05M analysis layer; console CSVs + token_accounting.json committed; estimate scorecard included
</commit_message>
<xml_diff>
--- a/release/method_from-227-to-30_policymaker-edition.docx
+++ b/release/method_from-227-to-30_policymaker-edition.docx
@@ -1132,7 +1132,7 @@
         <w:pStyle w:val="Heading1"/>
       </w:pPr>
       <w:r>
-        <w:t xml:space="preserve">Chapter 11 — What it cost: a token accounting</w:t>
+        <w:t xml:space="preserve">Chapter 11 — What it cost: a token accounting (measured)</w:t>
       </w:r>
     </w:p>
     <w:p>
@@ -1158,18 +1158,18 @@
           <w:sz w:val="19"/>
           <w:szCs w:val="19"/>
         </w:rPr>
-        <w:t xml:space="preserve">what did stages 2–6 actually consume in computation — and where did it go?</w:t>
-      </w:r>
-    </w:p>
-    <w:p>
-      <w:pPr>
-        <w:spacing w:after="130"/>
-      </w:pPr>
-      <w:r>
-        <w:rPr>
-          <w:rFonts w:ascii="Arial" w:cs="Arial" w:eastAsia="Arial" w:hAnsi="Arial"/>
-        </w:rPr>
-        <w:t xml:space="preserve">Because every model call in the analysis pipeline was cached and committed, one layer of this answer is measured rather than estimated. The other layer — the AI agent sessions that orchestrated the work — leaves no telemetry in the repository, so those figures are reasoned estimates with real uncertainty (a factor of two to three either way). Both layers are reported; the ratio between them is the finding.</w:t>
+        <w:t xml:space="preserve">what did stages 2–6 actually consume in computation — measured from billing telemetry, not estimated — and where did it go?</w:t>
+      </w:r>
+    </w:p>
+    <w:p>
+      <w:pPr>
+        <w:spacing w:after="130"/>
+      </w:pPr>
+      <w:r>
+        <w:rPr>
+          <w:rFonts w:ascii="Arial" w:cs="Arial" w:eastAsia="Arial" w:hAnsi="Arial"/>
+        </w:rPr>
+        <w:t xml:space="preserve">This chapter was first written as an estimate; it is now measured. The figures below come from the hourly API usage exports for the project's run days (console files committed alongside this paper as token_accounting.json and the two source CSVs), covering every model call the project made — both the analysis pipeline and the AI coding agents that orchestrated it. All calls ran on a single frontier model (Claude Opus 4.8).</w:t>
       </w:r>
     </w:p>
     <w:p>
@@ -1177,82 +1177,71 @@
         <w:pStyle w:val="Heading2"/>
       </w:pPr>
       <w:r>
-        <w:t xml:space="preserve">Layer 1 — The analysis itself (measured or reported per stage)</w:t>
-      </w:r>
-    </w:p>
-    <w:p>
-      <w:pPr>
-        <w:pStyle w:val="ListParagraph"/>
-        <w:numPr>
-          <w:ilvl w:val="0"/>
-          <w:numId w:val="2"/>
-        </w:numPr>
-        <w:spacing w:after="70"/>
-      </w:pPr>
-      <w:r>
-        <w:rPr>
-          <w:rFonts w:ascii="Arial" w:cs="Arial" w:eastAsia="Arial" w:hAnsi="Arial"/>
-        </w:rPr>
-        <w:t xml:space="preserve">Stages 2–3 (calculus port, closure test, engine build, citation verification): zero model tokens — by design. The vocabulary work was done by hand, the engine is deterministic code, and verification is retrieval plus comparison, not generation.</w:t>
-      </w:r>
-    </w:p>
-    <w:p>
-      <w:pPr>
-        <w:pStyle w:val="ListParagraph"/>
-        <w:numPr>
-          <w:ilvl w:val="0"/>
-          <w:numId w:val="2"/>
-        </w:numPr>
-        <w:spacing w:after="70"/>
-      </w:pPr>
-      <w:r>
-        <w:rPr>
-          <w:rFonts w:ascii="Arial" w:cs="Arial" w:eastAsia="Arial" w:hAnsi="Arial"/>
-        </w:rPr>
-        <w:t xml:space="preserve">Stage 4 (the AI layer over the pilot clusters): 68 calls, ~244,000 tokens (205k input / 39k output) — exact, from the run report.</w:t>
-      </w:r>
-    </w:p>
-    <w:p>
-      <w:pPr>
-        <w:pStyle w:val="ListParagraph"/>
-        <w:numPr>
-          <w:ilvl w:val="0"/>
-          <w:numId w:val="2"/>
-        </w:numPr>
-        <w:spacing w:after="70"/>
-      </w:pPr>
-      <w:r>
-        <w:rPr>
-          <w:rFonts w:ascii="Arial" w:cs="Arial" w:eastAsia="Arial" w:hAnsi="Arial"/>
-        </w:rPr>
-        <w:t xml:space="preserve">Stage 5 (corpus scale-out): ~180 calls, an estimated 550–700,000 tokens — call count exact, token figure extrapolated from the stage-4 per-call profile.</w:t>
-      </w:r>
-    </w:p>
-    <w:p>
-      <w:pPr>
-        <w:pStyle w:val="ListParagraph"/>
-        <w:numPr>
-          <w:ilvl w:val="0"/>
-          <w:numId w:val="2"/>
-        </w:numPr>
-        <w:spacing w:after="70"/>
-      </w:pPr>
-      <w:r>
-        <w:rPr>
-          <w:rFonts w:ascii="Arial" w:cs="Arial" w:eastAsia="Arial" w:hAnsi="Arial"/>
-        </w:rPr>
-        <w:t xml:space="preserve">Stage 6 (RBI benchmark, engine plus baseline over 163 circulars): ~200–300 calls, an estimated 700,000–1,200,000 tokens.</w:t>
-      </w:r>
-    </w:p>
-    <w:p>
-      <w:pPr>
-        <w:spacing w:after="130"/>
-      </w:pPr>
-      <w:r>
-        <w:rPr>
-          <w:rFonts w:ascii="Arial" w:cs="Arial" w:eastAsia="Arial" w:hAnsi="Arial"/>
-        </w:rPr>
-        <w:t xml:space="preserve">Total for the regulatory analysis proper: roughly 450–550 model calls and approximately 1.5–2 million tokens — every one of them cached in the repository, keyed by prompt hash, and replayable offline.</w:t>
+        <w:t xml:space="preserve">The measured totals</w:t>
+      </w:r>
+    </w:p>
+    <w:p>
+      <w:pPr>
+        <w:pStyle w:val="ListParagraph"/>
+        <w:numPr>
+          <w:ilvl w:val="0"/>
+          <w:numId w:val="2"/>
+        </w:numPr>
+        <w:spacing w:after="70"/>
+      </w:pPr>
+      <w:r>
+        <w:rPr>
+          <w:rFonts w:ascii="Arial" w:cs="Arial" w:eastAsia="Arial" w:hAnsi="Arial"/>
+        </w:rPr>
+        <w:t xml:space="preserve">Total tokens processed, stages 2–6: 225.1 million.</w:t>
+      </w:r>
+    </w:p>
+    <w:p>
+      <w:pPr>
+        <w:pStyle w:val="ListParagraph"/>
+        <w:numPr>
+          <w:ilvl w:val="0"/>
+          <w:numId w:val="2"/>
+        </w:numPr>
+        <w:spacing w:after="70"/>
+      </w:pPr>
+      <w:r>
+        <w:rPr>
+          <w:rFonts w:ascii="Arial" w:cs="Arial" w:eastAsia="Arial" w:hAnsi="Arial"/>
+        </w:rPr>
+        <w:t xml:space="preserve">Of which prompt-cache reads: 220.3 million — 97.9 percent. Cache reads are re-served context (the agent re-reading its own specifications, code, and artifacts each working turn), priced at a small fraction of fresh tokens.</w:t>
+      </w:r>
+    </w:p>
+    <w:p>
+      <w:pPr>
+        <w:pStyle w:val="ListParagraph"/>
+        <w:numPr>
+          <w:ilvl w:val="0"/>
+          <w:numId w:val="2"/>
+        </w:numPr>
+        <w:spacing w:after="70"/>
+      </w:pPr>
+      <w:r>
+        <w:rPr>
+          <w:rFonts w:ascii="Arial" w:cs="Arial" w:eastAsia="Arial" w:hAnsi="Arial"/>
+        </w:rPr>
+        <w:t xml:space="preserve">Fresh computation: 4.2 million input tokens (1.1M uncached + 3.1M cache writes) and 0.64 million output tokens — under 5 million tokens of genuinely new processing for the entire project.</w:t>
+      </w:r>
+    </w:p>
+    <w:p>
+      <w:pPr>
+        <w:pStyle w:val="ListParagraph"/>
+        <w:numPr>
+          <w:ilvl w:val="0"/>
+          <w:numId w:val="2"/>
+        </w:numPr>
+        <w:spacing w:after="70"/>
+      </w:pPr>
+      <w:r>
+        <w:rPr>
+          <w:rFonts w:ascii="Arial" w:cs="Arial" w:eastAsia="Arial" w:hAnsi="Arial"/>
+        </w:rPr>
+        <w:t xml:space="preserve">The analysis pipeline is separable in the telemetry: the hourly buckets with zero cache activity — the live distillation, scale-out, and benchmark passes — total roughly 1.05 million tokens (0.89M in / 0.16M out). One of those buckets, 208,367 in and 39,423 out, matches the stage-4 run report's self-logged 205k/39k almost exactly: the pipeline's internal telemetry and the billing system agree, a small but real cross-validation.</w:t>
       </w:r>
     </w:p>
     <w:p>
@@ -1260,18 +1249,18 @@
         <w:pStyle w:val="Heading2"/>
       </w:pPr>
       <w:r>
-        <w:t xml:space="preserve">Layer 2 — The orchestration (estimated)</w:t>
-      </w:r>
-    </w:p>
-    <w:p>
-      <w:pPr>
-        <w:spacing w:after="130"/>
-      </w:pPr>
-      <w:r>
-        <w:rPr>
-          <w:rFonts w:ascii="Arial" w:cs="Arial" w:eastAsia="Arial" w:hAnsi="Arial"/>
-        </w:rPr>
-        <w:t xml:space="preserve">The analysis calls were made by AI coding agents that read the specifications, wrote and tested the software, ran the pipelines, and wrote the reports — seven long agent sessions for the build and stages, plus the planning-and-review session that produced the specifications and human decision packets. Agentic sessions are input-dominated: each working turn re-reads a large and growing context, mostly served from prompt cache. Reasonable arithmetic — seven sessions of 50–150 turns at 100–200,000 tokens of context per turn — puts the orchestration layer at roughly 100–250 million tokens processed, of which perhaps 25–60 million were fresh (non-cache-served) tokens.</w:t>
+        <w:t xml:space="preserve">How the estimate fared</w:t>
+      </w:r>
+    </w:p>
+    <w:p>
+      <w:pPr>
+        <w:spacing w:after="130"/>
+      </w:pPr>
+      <w:r>
+        <w:rPr>
+          <w:rFonts w:ascii="Arial" w:cs="Arial" w:eastAsia="Arial" w:hAnsi="Arial"/>
+        </w:rPr>
+        <w:t xml:space="preserve">The prior version of this chapter estimated 150–300 million tokens processed (actual: 225M — in range), a 98-percent-plus scaffolding share (actual: 97.9% — confirmed), and an analysis layer of 1.5–2 million tokens (actual: ~1.05M — modestly overestimated). Its one real miss was instructive: it guessed 25–60 million fresh tokens, and the actual figure was 4.8 million — the prompt cache was roughly ten times more effective than assumed. The correction runs in the reassuring direction: the computation was cheaper than estimated, not more expensive.</w:t>
       </w:r>
     </w:p>
     <w:p>
@@ -1290,55 +1279,55 @@
         <w:rPr>
           <w:rFonts w:ascii="Arial" w:cs="Arial" w:eastAsia="Arial" w:hAnsi="Arial"/>
         </w:rPr>
-        <w:t xml:space="preserve">End to end, stages 2–6 processed on the order of 150–300 million tokens — and the actual regulatory analysis accounted for about 2 million of them, under 1.5 percent. More than 98 percent of the computation was scaffolding: agents reading specifications, writing and testing code, and re-reading their own artifacts. Three implications follow.</w:t>
-      </w:r>
-    </w:p>
-    <w:p>
-      <w:pPr>
-        <w:pStyle w:val="ListParagraph"/>
-        <w:numPr>
-          <w:ilvl w:val="0"/>
-          <w:numId w:val="2"/>
-        </w:numPr>
-        <w:spacing w:after="70"/>
-      </w:pPr>
-      <w:r>
-        <w:rPr>
-          <w:rFonts w:ascii="Arial" w:cs="Arial" w:eastAsia="Arial" w:hAnsi="Arial"/>
-        </w:rPr>
-        <w:t xml:space="preserve">The analysis layer is cheap and auditable. The ~2 million tokens that constitute the legal-analytical work are committed to the repository call by call. Re-verifying the entire analytical record costs nothing; extending it costs on the order of tens of dollars, not staff-years.</w:t>
-      </w:r>
-    </w:p>
-    <w:p>
-      <w:pPr>
-        <w:pStyle w:val="ListParagraph"/>
-        <w:numPr>
-          <w:ilvl w:val="0"/>
-          <w:numId w:val="2"/>
-        </w:numPr>
-        <w:spacing w:after="70"/>
-      </w:pPr>
-      <w:r>
-        <w:rPr>
-          <w:rFonts w:ascii="Arial" w:cs="Arial" w:eastAsia="Arial" w:hAnsi="Arial"/>
-        </w:rPr>
-        <w:t xml:space="preserve">The overhead is scaffolding, not analysis — and scaffolding costs fall fast. The 98 percent was spent building a reusable engine and its guardrails. A second corpus run on the same engine skips most of it; this is why the adapter recipe in the replication guide is short.</w:t>
-      </w:r>
-    </w:p>
-    <w:p>
-      <w:pPr>
-        <w:pStyle w:val="ListParagraph"/>
-        <w:numPr>
-          <w:ilvl w:val="0"/>
-          <w:numId w:val="2"/>
-        </w:numPr>
-        <w:spacing w:after="70"/>
-      </w:pPr>
-      <w:r>
-        <w:rPr>
-          <w:rFonts w:ascii="Arial" w:cs="Arial" w:eastAsia="Arial" w:hAnsi="Arial"/>
-        </w:rPr>
-        <w:t xml:space="preserve">The comparison to the alternative is not close. The RBI's equivalent exercise consumed 40-plus staff over multiple years. Even at the top of the estimate range, and even priced at premium model rates, the computation here costs less than a single staff-week — the binding constraint on regulatory clean-up has moved from analytical labor to review capacity and institutional will.</w:t>
+        <w:t xml:space="preserve">The actual regulatory analysis — distilling duties, proposing operations, running a cross-jurisdiction benchmark — consumed about 1 million tokens, roughly half of one percent of everything processed. Well over 99 percent was scaffolding: agents reading specifications, writing and testing the engine, and re-reading their own artifacts, almost all of it served from cache at deep discount. Three implications follow.</w:t>
+      </w:r>
+    </w:p>
+    <w:p>
+      <w:pPr>
+        <w:pStyle w:val="ListParagraph"/>
+        <w:numPr>
+          <w:ilvl w:val="0"/>
+          <w:numId w:val="2"/>
+        </w:numPr>
+        <w:spacing w:after="70"/>
+      </w:pPr>
+      <w:r>
+        <w:rPr>
+          <w:rFonts w:ascii="Arial" w:cs="Arial" w:eastAsia="Arial" w:hAnsi="Arial"/>
+        </w:rPr>
+        <w:t xml:space="preserve">The analysis layer is small, cheap, and fully auditable — committed to the repository call by call, replayable offline for nothing.</w:t>
+      </w:r>
+    </w:p>
+    <w:p>
+      <w:pPr>
+        <w:pStyle w:val="ListParagraph"/>
+        <w:numPr>
+          <w:ilvl w:val="0"/>
+          <w:numId w:val="2"/>
+        </w:numPr>
+        <w:spacing w:after="70"/>
+      </w:pPr>
+      <w:r>
+        <w:rPr>
+          <w:rFonts w:ascii="Arial" w:cs="Arial" w:eastAsia="Arial" w:hAnsi="Arial"/>
+        </w:rPr>
+        <w:t xml:space="preserve">The overhead is scaffolding, and scaffolding is reusable. A second corpus on the same engine skips most of the 99 percent; the adapter recipe in the replication guide is short for exactly this reason.</w:t>
+      </w:r>
+    </w:p>
+    <w:p>
+      <w:pPr>
+        <w:pStyle w:val="ListParagraph"/>
+        <w:numPr>
+          <w:ilvl w:val="0"/>
+          <w:numId w:val="2"/>
+        </w:numPr>
+        <w:spacing w:after="70"/>
+      </w:pPr>
+      <w:r>
+        <w:rPr>
+          <w:rFonts w:ascii="Arial" w:cs="Arial" w:eastAsia="Arial" w:hAnsi="Arial"/>
+        </w:rPr>
+        <w:t xml:space="preserve">At list prices, the entire computation — scaffolding included — costs on the order of a few hundred dollars: cache pricing turns the 225 million processed tokens into the billed equivalent of roughly 27 million. Against the alternative this method replaces — the RBI's 40-plus staff over multiple years — the comparison is not close. The binding constraint on regulatory clean-up is no longer analytical labor; it is review capacity and institutional will.</w:t>
       </w:r>
     </w:p>
     <w:p>
@@ -1361,7 +1350,7 @@
           <w:sz w:val="19"/>
           <w:szCs w:val="19"/>
         </w:rPr>
-        <w:t xml:space="preserve">Caveat, stated plainly: the Layer 2 figures are estimates. The repository preserves no session telemetry, and the honest uncertainty is two- to three-fold. The Layer 1 figures — the ones that bear on the trustworthiness of the analysis — are measured.</w:t>
+        <w:t xml:space="preserve">Scope note: these figures cover API usage on the project's run days and the model named above; the human reviewer's time — reading packets, making ~60 dispositions — is the one input this accounting cannot meter, and the one the method is designed to spend well.</w:t>
       </w:r>
     </w:p>
     <w:sectPr>

</xml_diff>